<commit_message>
Reorganize worksheets page and update licensing
</commit_message>
<xml_diff>
--- a/worksheets/wordDocs/EigenValuesVectors_Investigation_part2.docx
+++ b/worksheets/wordDocs/EigenValuesVectors_Investigation_part2.docx
@@ -1050,12 +1050,17 @@
                   <m:ctrlPr>
                     <w:rPr>
                       <w:rFonts w:ascii="Cambria Math" w:hAnsi="Cambria Math"/>
+                      <w:b/>
+                      <w:bCs/>
                       <w:i/>
                     </w:rPr>
                   </m:ctrlPr>
                 </m:sSubPr>
                 <m:e>
                   <m:r>
+                    <m:rPr>
+                      <m:sty m:val="bi"/>
+                    </m:rPr>
                     <w:rPr>
                       <w:rFonts w:ascii="Cambria Math" w:hAnsi="Cambria Math"/>
                     </w:rPr>
@@ -1064,6 +1069,9 @@
                 </m:e>
                 <m:sub>
                   <m:r>
+                    <m:rPr>
+                      <m:sty m:val="bi"/>
+                    </m:rPr>
                     <w:rPr>
                       <w:rFonts w:ascii="Cambria Math" w:hAnsi="Cambria Math"/>
                     </w:rPr>
@@ -1082,12 +1090,17 @@
                   <m:ctrlPr>
                     <w:rPr>
                       <w:rFonts w:ascii="Cambria Math" w:hAnsi="Cambria Math"/>
+                      <w:b/>
+                      <w:bCs/>
                       <w:i/>
                     </w:rPr>
                   </m:ctrlPr>
                 </m:sSubPr>
                 <m:e>
                   <m:r>
+                    <m:rPr>
+                      <m:sty m:val="bi"/>
+                    </m:rPr>
                     <w:rPr>
                       <w:rFonts w:ascii="Cambria Math" w:hAnsi="Cambria Math"/>
                     </w:rPr>
@@ -1096,6 +1109,9 @@
                 </m:e>
                 <m:sub>
                   <m:r>
+                    <m:rPr>
+                      <m:sty m:val="bi"/>
+                    </m:rPr>
                     <w:rPr>
                       <w:rFonts w:ascii="Cambria Math" w:hAnsi="Cambria Math"/>
                     </w:rPr>
@@ -1130,12 +1146,17 @@
                   <m:ctrlPr>
                     <w:rPr>
                       <w:rFonts w:ascii="Cambria Math" w:hAnsi="Cambria Math"/>
+                      <w:b/>
+                      <w:bCs/>
                       <w:i/>
                     </w:rPr>
                   </m:ctrlPr>
                 </m:sSubPr>
                 <m:e>
                   <m:r>
+                    <m:rPr>
+                      <m:sty m:val="bi"/>
+                    </m:rPr>
                     <w:rPr>
                       <w:rFonts w:ascii="Cambria Math" w:hAnsi="Cambria Math"/>
                     </w:rPr>
@@ -1144,6 +1165,9 @@
                 </m:e>
                 <m:sub>
                   <m:r>
+                    <m:rPr>
+                      <m:sty m:val="bi"/>
+                    </m:rPr>
                     <w:rPr>
                       <w:rFonts w:ascii="Cambria Math" w:hAnsi="Cambria Math"/>
                     </w:rPr>
@@ -1162,12 +1186,17 @@
                   <m:ctrlPr>
                     <w:rPr>
                       <w:rFonts w:ascii="Cambria Math" w:hAnsi="Cambria Math"/>
+                      <w:b/>
+                      <w:bCs/>
                       <w:i/>
                     </w:rPr>
                   </m:ctrlPr>
                 </m:sSubPr>
                 <m:e>
                   <m:r>
+                    <m:rPr>
+                      <m:sty m:val="bi"/>
+                    </m:rPr>
                     <w:rPr>
                       <w:rFonts w:ascii="Cambria Math" w:hAnsi="Cambria Math"/>
                     </w:rPr>
@@ -1176,6 +1205,9 @@
                 </m:e>
                 <m:sub>
                   <m:r>
+                    <m:rPr>
+                      <m:sty m:val="bi"/>
+                    </m:rPr>
                     <w:rPr>
                       <w:rFonts w:ascii="Cambria Math" w:hAnsi="Cambria Math"/>
                     </w:rPr>

</xml_diff>